<commit_message>
Added a chnages in proposal report
</commit_message>
<xml_diff>
--- a/LeaseProposal.docx
+++ b/LeaseProposal.docx
@@ -73,7 +73,6 @@
           <w:text/>
         </w:sdtPr>
         <w:sdtContent>
-          <w:proofErr w:type="spellStart"/>
           <w:r>
             <w:rPr>
               <w:rFonts w:cs="Microsoft Sans Serif"/>
@@ -83,7 +82,6 @@
             </w:rPr>
             <w:t>Tenant_Full_Name</w:t>
           </w:r>
-          <w:proofErr w:type="spellEnd"/>
         </w:sdtContent>
       </w:sdt>
       <w:r>
@@ -305,7 +303,6 @@
           <w:text/>
         </w:sdtPr>
         <w:sdtContent>
-          <w:proofErr w:type="spellStart"/>
           <w:r>
             <w:rPr>
               <w:rFonts w:cs="Microsoft Sans Serif"/>
@@ -314,7 +311,6 @@
             </w:rPr>
             <w:t>PropertyName</w:t>
           </w:r>
-          <w:proofErr w:type="spellEnd"/>
         </w:sdtContent>
       </w:sdt>
     </w:p>
@@ -388,7 +384,6 @@
           <w:text/>
         </w:sdtPr>
         <w:sdtContent>
-          <w:proofErr w:type="spellStart"/>
           <w:r>
             <w:rPr>
               <w:rFonts w:cs="Microsoft Sans Serif"/>
@@ -397,7 +392,6 @@
             </w:rPr>
             <w:t>UnitNumber</w:t>
           </w:r>
-          <w:proofErr w:type="spellEnd"/>
         </w:sdtContent>
       </w:sdt>
     </w:p>
@@ -471,7 +465,6 @@
           <w:text/>
         </w:sdtPr>
         <w:sdtContent>
-          <w:proofErr w:type="spellStart"/>
           <w:r>
             <w:rPr>
               <w:rFonts w:cs="Microsoft Sans Serif"/>
@@ -480,7 +473,6 @@
             </w:rPr>
             <w:t>Unit_Size</w:t>
           </w:r>
-          <w:proofErr w:type="spellEnd"/>
         </w:sdtContent>
       </w:sdt>
     </w:p>
@@ -552,7 +544,6 @@
           <w:text/>
         </w:sdtPr>
         <w:sdtContent>
-          <w:proofErr w:type="spellStart"/>
           <w:r>
             <w:rPr>
               <w:rFonts w:cs="Microsoft Sans Serif"/>
@@ -560,7 +551,6 @@
             </w:rPr>
             <w:t>Annual_Rent_Amount</w:t>
           </w:r>
-          <w:proofErr w:type="spellEnd"/>
         </w:sdtContent>
       </w:sdt>
     </w:p>
@@ -635,7 +625,6 @@
           <w:text/>
         </w:sdtPr>
         <w:sdtContent>
-          <w:proofErr w:type="spellStart"/>
           <w:r>
             <w:rPr>
               <w:rFonts w:cs="Microsoft Sans Serif"/>
@@ -643,7 +632,6 @@
             </w:rPr>
             <w:t>LeaseDuration</w:t>
           </w:r>
-          <w:proofErr w:type="spellEnd"/>
         </w:sdtContent>
       </w:sdt>
     </w:p>
@@ -1146,103 +1134,76 @@
         </w:rPr>
       </w:pPr>
     </w:p>
-    <w:p>
-      <w:pPr>
-        <w:widowControl w:val="0"/>
-        <w:tabs>
-          <w:tab w:val="left" w:pos="360"/>
-          <w:tab w:val="left" w:pos="720"/>
-          <w:tab w:val="left" w:pos="1080"/>
-          <w:tab w:val="left" w:pos="1440"/>
-          <w:tab w:val="left" w:pos="1800"/>
-          <w:tab w:val="left" w:pos="2160"/>
-          <w:tab w:val="left" w:pos="2520"/>
-          <w:tab w:val="left" w:pos="2880"/>
-          <w:tab w:val="left" w:pos="3240"/>
-          <w:tab w:val="left" w:pos="3600"/>
-          <w:tab w:val="left" w:pos="3960"/>
-          <w:tab w:val="left" w:pos="4320"/>
-          <w:tab w:val="left" w:pos="4680"/>
-          <w:tab w:val="left" w:pos="5040"/>
-          <w:tab w:val="left" w:pos="5400"/>
-          <w:tab w:val="left" w:pos="5760"/>
-          <w:tab w:val="left" w:pos="6120"/>
-          <w:tab w:val="left" w:pos="6480"/>
-          <w:tab w:val="left" w:pos="6840"/>
-          <w:tab w:val="left" w:pos="7200"/>
-          <w:tab w:val="left" w:pos="7560"/>
-          <w:tab w:val="left" w:pos="7920"/>
-          <w:tab w:val="left" w:pos="8280"/>
-          <w:tab w:val="left" w:pos="8640"/>
-          <w:tab w:val="left" w:pos="9000"/>
-          <w:tab w:val="left" w:pos="9360"/>
-          <w:tab w:val="left" w:pos="9720"/>
-          <w:tab w:val="left" w:pos="10080"/>
-          <w:tab w:val="left" w:pos="10440"/>
-        </w:tabs>
-        <w:autoSpaceDE w:val="0"/>
-        <w:autoSpaceDN w:val="0"/>
-        <w:adjustRightInd w:val="0"/>
-        <w:spacing w:after="0" w:line="240" w:lineRule="auto"/>
-        <w:jc w:val="both"/>
-        <w:rPr>
-          <w:rFonts w:cs="Microsoft Sans Serif"/>
-          <w:color w:val="000000"/>
-        </w:rPr>
-      </w:pPr>
-      <w:r>
-        <w:rPr>
-          <w:rFonts w:ascii="Microsoft Sans Serif" w:hAnsi="Microsoft Sans Serif" w:cs="Microsoft Sans Serif"/>
+    <w:bookmarkEnd w:displacedByCustomXml="next" w:id="0"/>
+    <w:sdt>
+      <w:sdtPr>
+        <w:rPr>
+          <w:rFonts w:cs="Microsoft Sans Serif"/>
           <w:b/>
           <w:bCs/>
           <w:color w:val="000000"/>
-          <w:sz w:val="21"/>
-          <w:szCs w:val="24"/>
-        </w:rPr>
-        <w:t>Al Ameen Property Investment LLC</w:t>
-      </w:r>
-      <w:bookmarkEnd w:id="0"/>
-    </w:p>
-    <w:p>
-      <w:pPr>
-        <w:widowControl w:val="0"/>
-        <w:tabs>
-          <w:tab w:val="left" w:pos="360"/>
-          <w:tab w:val="left" w:pos="720"/>
-          <w:tab w:val="left" w:pos="1080"/>
-          <w:tab w:val="left" w:pos="1440"/>
-          <w:tab w:val="left" w:pos="1800"/>
-          <w:tab w:val="left" w:pos="2160"/>
-          <w:tab w:val="left" w:pos="2520"/>
-          <w:tab w:val="left" w:pos="2880"/>
-          <w:tab w:val="left" w:pos="3240"/>
-          <w:tab w:val="left" w:pos="3600"/>
-          <w:tab w:val="left" w:pos="3960"/>
-          <w:tab w:val="left" w:pos="4320"/>
-          <w:tab w:val="left" w:pos="4680"/>
-          <w:tab w:val="left" w:pos="5040"/>
-          <w:tab w:val="left" w:pos="5400"/>
-          <w:tab w:val="left" w:pos="5760"/>
-          <w:tab w:val="left" w:pos="6120"/>
-          <w:tab w:val="left" w:pos="6480"/>
-          <w:tab w:val="left" w:pos="6840"/>
-          <w:tab w:val="left" w:pos="7200"/>
-          <w:tab w:val="left" w:pos="7560"/>
-          <w:tab w:val="left" w:pos="7920"/>
-          <w:tab w:val="left" w:pos="8280"/>
-        </w:tabs>
-        <w:autoSpaceDE w:val="0"/>
-        <w:autoSpaceDN w:val="0"/>
-        <w:adjustRightInd w:val="0"/>
-        <w:spacing w:after="0" w:line="240" w:lineRule="auto"/>
-        <w:rPr>
-          <w:rFonts w:cs="Microsoft Sans Serif"/>
-          <w:b/>
-          <w:bCs/>
-          <w:color w:val="000000"/>
-        </w:rPr>
-      </w:pPr>
-    </w:p>
+        </w:rPr>
+        <w:id w:val="130064082"/>
+        <w:placeholder>
+          <w:docPart w:val="DefaultPlaceholder_-1854013440"/>
+        </w:placeholder>
+        <w:dataBinding w:prefixMappings="xmlns:ns0='urn:microsoft-dynamics-nav/reports/Proposal_Report/50102/'" w:xpath="/ns0:NavWordReportXmlPart[1]/ns0:LeaseProposalDetails[1]/ns0:CompanyName[1]" w:storeItemID="{A84FB7FE-8DC4-44D9-93CF-017B5901FD63}"/>
+        <w:text/>
+        <w:alias w:val="#Nav: /LeaseProposalDetails/CompanyName"/>
+        <w:tag w:val="#Nav: Proposal_Report/50102"/>
+      </w:sdtPr>
+      <w:sdtContent>
+        <w:p>
+          <w:pPr>
+            <w:widowControl w:val="0"/>
+            <w:tabs>
+              <w:tab w:val="left" w:pos="360"/>
+              <w:tab w:val="left" w:pos="720"/>
+              <w:tab w:val="left" w:pos="1080"/>
+              <w:tab w:val="left" w:pos="1440"/>
+              <w:tab w:val="left" w:pos="1800"/>
+              <w:tab w:val="left" w:pos="2160"/>
+              <w:tab w:val="left" w:pos="2520"/>
+              <w:tab w:val="left" w:pos="2880"/>
+              <w:tab w:val="left" w:pos="3240"/>
+              <w:tab w:val="left" w:pos="3600"/>
+              <w:tab w:val="left" w:pos="3960"/>
+              <w:tab w:val="left" w:pos="4320"/>
+              <w:tab w:val="left" w:pos="4680"/>
+              <w:tab w:val="left" w:pos="5040"/>
+              <w:tab w:val="left" w:pos="5400"/>
+              <w:tab w:val="left" w:pos="5760"/>
+              <w:tab w:val="left" w:pos="6120"/>
+              <w:tab w:val="left" w:pos="6480"/>
+              <w:tab w:val="left" w:pos="6840"/>
+              <w:tab w:val="left" w:pos="7200"/>
+              <w:tab w:val="left" w:pos="7560"/>
+              <w:tab w:val="left" w:pos="7920"/>
+              <w:tab w:val="left" w:pos="8280"/>
+            </w:tabs>
+            <w:autoSpaceDE w:val="0"/>
+            <w:autoSpaceDN w:val="0"/>
+            <w:adjustRightInd w:val="0"/>
+            <w:spacing w:after="0" w:line="240" w:lineRule="auto"/>
+            <w:rPr>
+              <w:rFonts w:cs="Microsoft Sans Serif"/>
+              <w:b/>
+              <w:bCs/>
+              <w:color w:val="000000"/>
+            </w:rPr>
+          </w:pPr>
+          <w:r>
+            <w:rPr>
+              <w:rFonts w:cs="Microsoft Sans Serif"/>
+              <w:b/>
+              <w:bCs/>
+              <w:color w:val="000000"/>
+            </w:rPr>
+            <w:t>CompanyName</w:t>
+          </w:r>
+        </w:p>
+      </w:sdtContent>
+    </w:sdt>
     <w:p>
       <w:pPr>
         <w:widowControl w:val="0"/>
@@ -1432,8 +1393,8 @@
                                 </w:rPr>
                                 <w:drawing>
                                   <wp:inline distT="0" distB="0" distL="0" distR="0" wp14:anchorId="70A2060D" wp14:editId="1F5DA32B">
-                                    <wp:extent cx="1714500" cy="716280"/>
-                                    <wp:effectExtent l="0" t="0" r="0" b="7620"/>
+                                    <wp:extent cx="716408" cy="716408"/>
+                                    <wp:effectExtent l="0" t="0" r="7620" b="7620"/>
                                     <wp:docPr id="384324597" name="Picture 1"/>
                                     <wp:cNvGraphicFramePr>
                                       <a:graphicFrameLocks xmlns:a="http://schemas.openxmlformats.org/drawingml/2006/main" noChangeAspect="1"/>
@@ -1456,7 +1417,7 @@
                                           <pic:spPr bwMode="auto">
                                             <a:xfrm>
                                               <a:off x="0" y="0"/>
-                                              <a:ext cx="1714806" cy="716408"/>
+                                              <a:ext cx="716408" cy="716408"/>
                                             </a:xfrm>
                                             <a:prstGeom prst="rect">
                                               <a:avLst/>
@@ -1517,8 +1478,8 @@
                           </w:rPr>
                           <w:drawing>
                             <wp:inline distT="0" distB="0" distL="0" distR="0" wp14:anchorId="70A2060D" wp14:editId="1F5DA32B">
-                              <wp:extent cx="1714500" cy="716280"/>
-                              <wp:effectExtent l="0" t="0" r="0" b="7620"/>
+                              <wp:extent cx="716408" cy="716408"/>
+                              <wp:effectExtent l="0" t="0" r="7620" b="7620"/>
                               <wp:docPr id="384324597" name="Picture 1"/>
                               <wp:cNvGraphicFramePr>
                                 <a:graphicFrameLocks xmlns:a="http://schemas.openxmlformats.org/drawingml/2006/main" noChangeAspect="1"/>
@@ -1541,7 +1502,7 @@
                                     <pic:spPr bwMode="auto">
                                       <a:xfrm>
                                         <a:off x="0" y="0"/>
-                                        <a:ext cx="1714806" cy="716408"/>
+                                        <a:ext cx="716408" cy="716408"/>
                                       </a:xfrm>
                                       <a:prstGeom prst="rect">
                                         <a:avLst/>
@@ -2158,12 +2119,14 @@
     <w:rsid w:val="00013A81"/>
     <w:rsid w:val="001743AD"/>
     <w:rsid w:val="001E2BE2"/>
+    <w:rsid w:val="0022671C"/>
     <w:rsid w:val="00306E7E"/>
     <w:rsid w:val="00325C10"/>
     <w:rsid w:val="00340A44"/>
     <w:rsid w:val="00352827"/>
     <w:rsid w:val="0039202E"/>
     <w:rsid w:val="004D75A9"/>
+    <w:rsid w:val="0054048C"/>
     <w:rsid w:val="0059722A"/>
     <w:rsid w:val="00671606"/>
     <w:rsid w:val="006868E4"/>
@@ -2947,13 +2910,77 @@
 </a:theme>
 </file>
 
-<file path=customXml/item1.xml>��< ? x m l   v e r s i o n = " 1 . 0 "   e n c o d i n g = " u t f - 1 6 " ? > - 
- < N a v W o r d R e p o r t X m l P a r t   x m l n s = " u r n : m i c r o s o f t - d y n a m i c s - n a v / r e p o r t s / P r o p o s a l _ R e p o r t / 5 0 1 0 2 / " > +<file path=customXml/item1.xml>��< ? x m l   v e r s i o n = " 1 . 0 "   e n c o d i n g = " u t f - 1 6 " ? > < N a v W o r d R e p o r t X m l P a r t   x m l n s = " u r n : m i c r o s o f t - d y n a m i c s - n a v / r e p o r t s / P r o p o s a l _ R e p o r t / 5 0 1 0 2 / " > + 
+     < B C R e p o r t I n f o r m a t i o n > + 
+         < R e p o r t M e t a d a t a > + 
+             < E x t e n s i o n I d > E x t e n s i o n   I D < / E x t e n s i o n I d > + 
+             < E x t e n s i o n N a m e > E x t e n s i o n   N a m e < / E x t e n s i o n N a m e > + 
+             < E x t e n s i o n P u b l i s h e r > E x t e n s i o n   P u b l i s h e r < / E x t e n s i o n P u b l i s h e r > + 
+             < E x t e n s i o n V e r s i o n > E x t e n s i o n   V e r s i o n < / E x t e n s i o n V e r s i o n > + 
+             < R e p o r t I d > R e p o r t   I D < / R e p o r t I d > + 
+             < R e p o r t N a m e > R e p o r t   N a m e < / R e p o r t N a m e > + 
+             < A b o u t T h i s R e p o r t T i t l e > A b o u t   T h i s   R e p o r t   T i t l e < / A b o u t T h i s R e p o r t T i t l e > + 
+             < A b o u t T h i s R e p o r t T e x t > A b o u t   T h i s   R e p o r t   T e x t < / A b o u t T h i s R e p o r t T e x t > + 
+             < R e p o r t H e l p L i n k > R e p o r t   H e l p   L i n k < / R e p o r t H e l p L i n k > + 
+         < / R e p o r t M e t a d a t a > + 
+         < R e p o r t R e q u e s t > + 
+             < T e n a n t E n t r a I d > T e n a n t   E n t r a   I d < / T e n a n t E n t r a I d > + 
+             < E n v i r o n m e n t N a m e > E n v i r o n m e n t   N a m e < / E n v i r o n m e n t N a m e > + 
+             < E n v i r o n m e n t T y p e > E n v i r o n m e n t   T y p e < / E n v i r o n m e n t T y p e > + 
+             < C o m p a n y N a m e > C o m p a n y   N a m e < / C o m p a n y N a m e > + 
+             < C o m p a n y D i s p l a y N a m e > C o m p a n y   D i s p l a y   N a m e < / C o m p a n y D i s p l a y N a m e > + 
+             < C o m p a n y I d > C o m p a n y   I D < / C o m p a n y I d > + 
+             < U s e r N a m e > U s e r   N a m e < / U s e r N a m e > + 
+             < D a t e A n d T i m e > D a t e   a n d   T i m e < / D a t e A n d T i m e > + 
+             < L a n g u a g e > L a n g u a g e < / L a n g u a g e > + 
+             < F o r m a t R e g i o n > F o r m a t   R e g i o n < / F o r m a t R e g i o n > + 
+             < D a t e T i m e V a l u e s > + 
+                 < Y e a r > Y e a r < / Y e a r > + 
+                 < M o n t h N u m b e r > M o n t h   N u m b e r < / M o n t h N u m b e r > + 
+                 < D a y N u m b e r > D a y   N u m b e r < / D a y N u m b e r > + 
+                 < H o u r > H o u r < / H o u r > + 
+                 < M i n u t e > M i n u t e < / M i n u t e > + 
+             < / D a t e T i m e V a l u e s > + 
+         < / R e p o r t R e q u e s t > + 
+     < / B C R e p o r t I n f o r m a t i o n >   
      < L e a s e P r o p o s a l D e t a i l s >   
          < A n n u a l _ R e n t _ A m o u n t > A n n u a l _ R e n t _ A m o u n t < / A n n u a l _ R e n t _ A m o u n t > + 
+         < C o m p a n y N a m e > C o m p a n y N a m e < / C o m p a n y N a m e >   
          < C o m p a n y P i c t u r e > C o m p a n y P i c t u r e < / C o m p a n y P i c t u r e >   

</xml_diff>